<commit_message>
Add final project deliverables and reports
Add final deliverables and generated outputs for multiple coursework projects. Includes TrabajoFinal artifacts (build_report.py, final notebook/docx/pdf, output CSVs and kmeans image) and saves notebook execution outputs. Adds Topicos-Selectos activity 9 deliverables and helper scripts (analyze.py, explore.py, generate_report.py) plus SKU analysis spreadsheet. Also updates small text/docx changes in programming and activity folders. These changes primarily add generated reports and deliverable files.
</commit_message>
<xml_diff>
--- a/2do-semestre/topicos-selectos-i/tareas/actividades/actividad-9/Actividad9_TopicosSelectos_CarlosPulidoRosas.docx
+++ b/2do-semestre/topicos-selectos-i/tareas/actividades/actividad-9/Actividad9_TopicosSelectos_CarlosPulidoRosas.docx
@@ -612,10 +612,10 @@
         <w:t>Se cargaron 13 bases de datos en Python con pandas. Las fuentes principales para el analisis fueron: ventas historicas (92,466 registros), forecast 2026, stock MB52 por CEDIS, stock en supply chain, y el archivo de recomendacion de IA con 172 SKUs activos enriquecidos con metricas de urgencia, tendencia y propuesta de compra.</w:t>
         <w:br/>
         <w:br/>
-        <w:t>Seleccion de 5 SKUs: se eligieron buscando diversidad en clase ABC, estado de urgencia (CRITICAL, HIGH, MEDIUM, LOW) y tendencia de ventas (GROWING, STABLE, STRONG GROWTH, DECLINING).</w:t>
+        <w:t>Seleccion de 5 SKUs de la lista del profesor: se eligieron maximizando diversidad de tipos de problema: LED06/10W. (quiebre con SC elevado), REFLED/300W (forecast incorrecto), SUBSOL/60W (compra excesiva Clase A), REFLED/200W (sobreinventario en SC) y T-SUBFOT/100W-A (problema logistico).</w:t>
         <w:br/>
         <w:br/>
-        <w:t>Metodologia de recomendacion propia: se calculo el riesgo de desabasto comparando el stock en mano (dias disponibles) contra el lead time total de la cadena de suministro (120 dias). Si el stockout ocurre antes de que el inventario en SC pueda llegar, se clasifica como CRITICAL o HIGH segun la brecha de dias.</w:t>
+        <w:t>Metodologia de recomendacion propia: arbol de decision con 9 casos que priorizan en orden: (1) congelar si SC &gt; 4 meses, (2) compra de emergencia si stockout inminente y lead time no puede cubrir la brecha, (3) acelerar SC si stockout &lt; 30d pero cobertura total supera objetivo, (4) compra parcial si stockout cercano con demanda decreciente, y (5) freeze si cobertura total &gt; 3 meses con senales negativas.</w:t>
       </w:r>
     </w:p>
     <w:p>
@@ -1130,7 +1130,7 @@
               <w:rPr>
                 <w:sz w:val="14"/>
               </w:rPr>
-              <w:t>SUBSOL/60W</w:t>
+              <w:t>REFLED/300W</w:t>
             </w:r>
           </w:p>
         </w:tc>
@@ -1143,7 +1143,7 @@
               <w:rPr>
                 <w:sz w:val="14"/>
               </w:rPr>
-              <w:t>A</w:t>
+              <w:t>B</w:t>
             </w:r>
           </w:p>
         </w:tc>
@@ -1156,7 +1156,7 @@
               <w:rPr>
                 <w:sz w:val="14"/>
               </w:rPr>
-              <w:t>STABLE</w:t>
+              <w:t>DECLINING</w:t>
             </w:r>
           </w:p>
         </w:tc>
@@ -1169,7 +1169,7 @@
               <w:rPr>
                 <w:sz w:val="14"/>
               </w:rPr>
-              <w:t>1.48</w:t>
+              <w:t>0.22</w:t>
             </w:r>
           </w:p>
         </w:tc>
@@ -1182,7 +1182,7 @@
               <w:rPr>
                 <w:sz w:val="14"/>
               </w:rPr>
-              <w:t>2.10</w:t>
+              <w:t>2.14</w:t>
             </w:r>
           </w:p>
         </w:tc>
@@ -1195,7 +1195,7 @@
               <w:rPr>
                 <w:sz w:val="14"/>
               </w:rPr>
-              <w:t>3.58</w:t>
+              <w:t>2.36</w:t>
             </w:r>
           </w:p>
         </w:tc>
@@ -1208,7 +1208,7 @@
               <w:rPr>
                 <w:sz w:val="14"/>
               </w:rPr>
-              <w:t>44</w:t>
+              <w:t>7</w:t>
             </w:r>
           </w:p>
         </w:tc>
@@ -1221,14 +1221,14 @@
               <w:rPr>
                 <w:sz w:val="14"/>
               </w:rPr>
-              <w:t>2,250</w:t>
+              <w:t>520</w:t>
             </w:r>
           </w:p>
         </w:tc>
         <w:tc>
           <w:tcPr>
             <w:tcW w:type="dxa" w:w="737"/>
-            <w:shd w:val="clear" w:color="auto" w:fill="0070C0"/>
+            <w:shd w:val="clear" w:color="auto" w:fill="C00000"/>
           </w:tcPr>
           <w:p>
             <w:r>
@@ -1237,7 +1237,7 @@
                 <w:color w:val="FFFFFF"/>
                 <w:sz w:val="14"/>
               </w:rPr>
-              <w:t>LOW</w:t>
+              <w:t>CRITICAL</w:t>
             </w:r>
           </w:p>
         </w:tc>
@@ -1250,7 +1250,7 @@
               <w:rPr>
                 <w:sz w:val="14"/>
               </w:rPr>
-              <w:t>Frenar nueva OC; cobertura total 3.6 meses con SC elevado (2.1 meses) y YoY -59%. Considerar promocion para acelerar rotacion. Riesgo: sobreinventario y capital detenido.</w:t>
+              <w:t>Acelerar arribo de SC existente y emitir OC de emergencia 520 pzas (1.5 meses); stock fisico se agota en 7 dias vs lead time 120 dias. Riesgo: quiebre inminente con impacto a clientes.</w:t>
             </w:r>
           </w:p>
         </w:tc>
@@ -1279,7 +1279,7 @@
               <w:rPr>
                 <w:sz w:val="14"/>
               </w:rPr>
-              <w:t>Comprar urgentemente 2,250 piezas (~2.0 meses) y acelerar booking inmediato; stock actual de 1,672 piezas solo cubre 1.5 meses vs forecast mensual de 1,624. SKU A con tendencia STABLE. Riesgo: stockout en ~44 días.</w:t>
+              <w:t>Comprar urgentemente 520 piezas (~1.5 meses) y acelerar booking inmediato; stock actual de 56 piezas solo cubre 0.2 meses vs forecast mensual de 518. SKU B con tendencia DECLINING. Riesgo: stockout en ~7 días.</w:t>
             </w:r>
           </w:p>
         </w:tc>
@@ -1295,7 +1295,7 @@
               <w:rPr>
                 <w:sz w:val="14"/>
               </w:rPr>
-              <w:t>LED06/10W3</w:t>
+              <w:t>SUBSOL/60W</w:t>
             </w:r>
           </w:p>
         </w:tc>
@@ -1309,7 +1309,7 @@
               <w:rPr>
                 <w:sz w:val="14"/>
               </w:rPr>
-              <w:t>B</w:t>
+              <w:t>A</w:t>
             </w:r>
           </w:p>
         </w:tc>
@@ -1337,7 +1337,7 @@
               <w:rPr>
                 <w:sz w:val="14"/>
               </w:rPr>
-              <w:t>0.03</w:t>
+              <w:t>1.48</w:t>
             </w:r>
           </w:p>
         </w:tc>
@@ -1351,7 +1351,7 @@
               <w:rPr>
                 <w:sz w:val="14"/>
               </w:rPr>
-              <w:t>0.39</w:t>
+              <w:t>2.10</w:t>
             </w:r>
           </w:p>
         </w:tc>
@@ -1365,7 +1365,7 @@
               <w:rPr>
                 <w:sz w:val="14"/>
               </w:rPr>
-              <w:t>0.42</w:t>
+              <w:t>3.58</w:t>
             </w:r>
           </w:p>
         </w:tc>
@@ -1379,7 +1379,7 @@
               <w:rPr>
                 <w:sz w:val="14"/>
               </w:rPr>
-              <w:t>1</w:t>
+              <w:t>44</w:t>
             </w:r>
           </w:p>
         </w:tc>
@@ -1393,7 +1393,7 @@
               <w:rPr>
                 <w:sz w:val="14"/>
               </w:rPr>
-              <w:t>26,160</w:t>
+              <w:t>2,250</w:t>
             </w:r>
           </w:p>
         </w:tc>
@@ -1401,7 +1401,7 @@
           <w:tcPr>
             <w:tcW w:type="dxa" w:w="737"/>
             <w:shd w:val="clear" w:color="auto" w:fill="F2F2F2"/>
-            <w:shd w:val="clear" w:color="auto" w:fill="C00000"/>
+            <w:shd w:val="clear" w:color="auto" w:fill="0070C0"/>
           </w:tcPr>
           <w:p>
             <w:r>
@@ -1410,7 +1410,7 @@
                 <w:color w:val="FFFFFF"/>
                 <w:sz w:val="14"/>
               </w:rPr>
-              <w:t>CRITICAL</w:t>
+              <w:t>LOW</w:t>
             </w:r>
           </w:p>
         </w:tc>
@@ -1424,7 +1424,7 @@
               <w:rPr>
                 <w:sz w:val="14"/>
               </w:rPr>
-              <w:t>Acelerar arribo de SC existente y emitir OC de emergencia 26,160 pzas (2.0 meses); stock fisico se agota en 1 dias vs lead time 120 dias. Riesgo: quiebre inminente con impacto a clientes.</w:t>
+              <w:t>Frenar nueva OC; cobertura total 3.6 meses con SC elevado (2.1 meses) y YoY -59%. Considerar promocion para acelerar rotacion. Riesgo: sobreinventario y capital detenido.</w:t>
             </w:r>
           </w:p>
         </w:tc>
@@ -1455,7 +1455,7 @@
               <w:rPr>
                 <w:sz w:val="14"/>
               </w:rPr>
-              <w:t>Comprar urgentemente 26,160 piezas (~2.0 meses) y acelerar booking inmediato; stock actual de 329 piezas solo cubre 0.0 meses vs forecast mensual de 0. SKU B con tendencia STABLE. Riesgo: stockout en ~1 días.</w:t>
+              <w:t>Comprar urgentemente 2,250 piezas (~2.0 meses) y acelerar booking inmediato; stock actual de 1,672 piezas solo cubre 1.5 meses vs forecast mensual de 1,624. SKU A con tendencia STABLE. Riesgo: stockout en ~44 días.</w:t>
             </w:r>
           </w:p>
         </w:tc>
@@ -1470,7 +1470,7 @@
               <w:rPr>
                 <w:sz w:val="14"/>
               </w:rPr>
-              <w:t>ADAPTADOR/E40</w:t>
+              <w:t>REFLED/200W</w:t>
             </w:r>
           </w:p>
         </w:tc>
@@ -1496,7 +1496,7 @@
               <w:rPr>
                 <w:sz w:val="14"/>
               </w:rPr>
-              <w:t>STRONG GROWTH</w:t>
+              <w:t>DECLINING</w:t>
             </w:r>
           </w:p>
         </w:tc>
@@ -1509,7 +1509,7 @@
               <w:rPr>
                 <w:sz w:val="14"/>
               </w:rPr>
-              <w:t>1.74</w:t>
+              <w:t>1.56</w:t>
             </w:r>
           </w:p>
         </w:tc>
@@ -1522,7 +1522,7 @@
               <w:rPr>
                 <w:sz w:val="14"/>
               </w:rPr>
-              <w:t>1.74</w:t>
+              <w:t>4.76</w:t>
             </w:r>
           </w:p>
         </w:tc>
@@ -1535,7 +1535,7 @@
               <w:rPr>
                 <w:sz w:val="14"/>
               </w:rPr>
-              <w:t>3.48</w:t>
+              <w:t>6.32</w:t>
             </w:r>
           </w:p>
         </w:tc>
@@ -1548,7 +1548,7 @@
               <w:rPr>
                 <w:sz w:val="14"/>
               </w:rPr>
-              <w:t>52</w:t>
+              <w:t>47</w:t>
             </w:r>
           </w:p>
         </w:tc>
@@ -1561,7 +1561,36 @@
               <w:rPr>
                 <w:sz w:val="14"/>
               </w:rPr>
-              <w:t>500</w:t>
+              <w:t>1,960</w:t>
+            </w:r>
+          </w:p>
+        </w:tc>
+        <w:tc>
+          <w:tcPr>
+            <w:tcW w:type="dxa" w:w="737"/>
+            <w:shd w:val="clear" w:color="auto" w:fill="0070C0"/>
+          </w:tcPr>
+          <w:p>
+            <w:r>
+              <w:rPr>
+                <w:b/>
+                <w:color w:val="FFFFFF"/>
+                <w:sz w:val="14"/>
+              </w:rPr>
+              <w:t>LOW</w:t>
+            </w:r>
+          </w:p>
+        </w:tc>
+        <w:tc>
+          <w:tcPr>
+            <w:tcW w:type="dxa" w:w="3118"/>
+          </w:tcPr>
+          <w:p>
+            <w:r>
+              <w:rPr>
+                <w:sz w:val="14"/>
+              </w:rPr>
+              <w:t>Congelar compras y revisar forecast; supply chain acumula 4.8 meses con tendencia DECLINING y YoY -60%. Consumir tránsito antes de evaluar nueva orden. Riesgo: capital detenido y posible obsolescencia.</w:t>
             </w:r>
           </w:p>
         </w:tc>
@@ -1590,36 +1619,7 @@
               <w:rPr>
                 <w:sz w:val="14"/>
               </w:rPr>
-              <w:t>Planear compra escalonada de 500 pzas en 30 dias; cobertura actual 3.5 meses dentro de rango objetivo. Monitorear tendencia STRONG GROWTH y YoY -7% antes de confirmar volumen. Riesgo: retraso de OC si la demanda acelera.</w:t>
-            </w:r>
-          </w:p>
-        </w:tc>
-        <w:tc>
-          <w:tcPr>
-            <w:tcW w:type="dxa" w:w="737"/>
-            <w:shd w:val="clear" w:color="auto" w:fill="FFC000"/>
-          </w:tcPr>
-          <w:p>
-            <w:r>
-              <w:rPr>
-                <w:b/>
-                <w:color w:val="FFFFFF"/>
-                <w:sz w:val="14"/>
-              </w:rPr>
-              <w:t>MEDIUM</w:t>
-            </w:r>
-          </w:p>
-        </w:tc>
-        <w:tc>
-          <w:tcPr>
-            <w:tcW w:type="dxa" w:w="3118"/>
-          </w:tcPr>
-          <w:p>
-            <w:r>
-              <w:rPr>
-                <w:sz w:val="14"/>
-              </w:rPr>
-              <w:t>Comprar normal 500 piezas para sostener cobertura objetivo de 1.9 meses; el SKU mantiene 1.7 meses en stock y 1.7 meses considerando supply chain total. Monitorear tendencia STRONG GROWTH.</w:t>
+              <w:t>Comprar normal 1,960 piezas para sostener cobertura objetivo de 1.3 meses; el SKU mantiene 1.6 meses en stock y 4.8 meses considerando supply chain total. Monitorear tendencia DECLINING.</w:t>
             </w:r>
           </w:p>
         </w:tc>
@@ -1635,7 +1635,7 @@
               <w:rPr>
                 <w:sz w:val="14"/>
               </w:rPr>
-              <w:t>LRD/9W</w:t>
+              <w:t>T-SUBFOT/100W-A</w:t>
             </w:r>
           </w:p>
         </w:tc>
@@ -1649,7 +1649,7 @@
               <w:rPr>
                 <w:sz w:val="14"/>
               </w:rPr>
-              <w:t>B</w:t>
+              <w:t>A</w:t>
             </w:r>
           </w:p>
         </w:tc>
@@ -1663,7 +1663,7 @@
               <w:rPr>
                 <w:sz w:val="14"/>
               </w:rPr>
-              <w:t>DECLINING</w:t>
+              <w:t>STRONG GROWTH</w:t>
             </w:r>
           </w:p>
         </w:tc>
@@ -1677,7 +1677,7 @@
               <w:rPr>
                 <w:sz w:val="14"/>
               </w:rPr>
-              <w:t>1.17</w:t>
+              <w:t>0.87</w:t>
             </w:r>
           </w:p>
         </w:tc>
@@ -1691,7 +1691,7 @@
               <w:rPr>
                 <w:sz w:val="14"/>
               </w:rPr>
-              <w:t>5.37</w:t>
+              <w:t>7.12</w:t>
             </w:r>
           </w:p>
         </w:tc>
@@ -1705,7 +1705,7 @@
               <w:rPr>
                 <w:sz w:val="14"/>
               </w:rPr>
-              <w:t>6.54</w:t>
+              <w:t>7.99</w:t>
             </w:r>
           </w:p>
         </w:tc>
@@ -1719,7 +1719,7 @@
               <w:rPr>
                 <w:sz w:val="14"/>
               </w:rPr>
-              <w:t>35</w:t>
+              <w:t>26</w:t>
             </w:r>
           </w:p>
         </w:tc>
@@ -1733,7 +1733,7 @@
               <w:rPr>
                 <w:sz w:val="14"/>
               </w:rPr>
-              <w:t>810</w:t>
+              <w:t>N/D</w:t>
             </w:r>
           </w:p>
         </w:tc>
@@ -1764,7 +1764,7 @@
               <w:rPr>
                 <w:sz w:val="14"/>
               </w:rPr>
-              <w:t>Congelar compras y revisar forecast; supply chain acumula 5.4 meses con tendencia DECLINING y YoY -57%. Consumir tránsito antes de evaluar nueva orden. Riesgo: capital detenido y posible obsolescencia.</w:t>
+              <w:t>Congelar compras y revisar forecast; supply chain acumula 7.1 meses con tendencia STRONG GROWTH y YoY -7%. Consumir tránsito antes de evaluar nueva orden. Riesgo: capital detenido y posible obsolescencia.</w:t>
             </w:r>
           </w:p>
         </w:tc>
@@ -1772,7 +1772,7 @@
           <w:tcPr>
             <w:tcW w:type="dxa" w:w="737"/>
             <w:shd w:val="clear" w:color="auto" w:fill="F2F2F2"/>
-            <w:shd w:val="clear" w:color="auto" w:fill="0070C0"/>
+            <w:shd w:val="clear" w:color="auto" w:fill="FFC000"/>
           </w:tcPr>
           <w:p>
             <w:r>
@@ -1781,7 +1781,7 @@
                 <w:color w:val="FFFFFF"/>
                 <w:sz w:val="14"/>
               </w:rPr>
-              <w:t>LOW</w:t>
+              <w:t>MEDIUM</w:t>
             </w:r>
           </w:p>
         </w:tc>
@@ -1795,7 +1795,7 @@
               <w:rPr>
                 <w:sz w:val="14"/>
               </w:rPr>
-              <w:t>Comprar urgentemente 810 piezas (~0.9 meses) y acelerar booking inmediato; stock actual de 839 piezas solo cubre 1.2 meses vs forecast mensual de 0. SKU B con tendencia DECLINING. Riesgo: stockout en ~35 días.</w:t>
+              <w:t>Acelerar booking de 2,360 piezas y priorizar carga marítima; la cobertura total es de 7.1 meses y existe atraso operativo en supply chain. Riesgo: retraso logístico.</w:t>
             </w:r>
           </w:p>
         </w:tc>
@@ -1824,22 +1824,22 @@
         <w:t>Analisis de divergencias entre modelo propio e IA:</w:t>
         <w:br/>
         <w:br/>
-        <w:t>Ambos modelos usan el marco ACCION + MAGNITUD + POR QUE + RIESGO con prioridad en proteger flujo y evitar sobreinventario. Las divergencias surgen de matices en la ponderacion de variables:</w:t>
+        <w:t>Ambos modelos usan el marco ACCION + MAGNITUD + POR QUE + RIESGO. Las divergencias principales son:</w:t>
         <w:br/>
         <w:br/>
-        <w:t>- LED06/10W. (HIGH propio / CRITICAL IA): Acuerdo en urgencia, diferencia en magnitud. Mi modelo detecta que el SC ya cubre 3.5 meses y recomienda acelerar arribo en lugar de emitir nueva OC; la IA ordena compra adicional de 578,100 pzas ignorando que la cobertura total de 4.2 meses ya supera el objetivo operativo de 2 meses.</w:t>
+        <w:t>- LED06/10W. (LOW propio / CRITICAL IA): Divergencia en diagnóstico. La IA clasifica CRITICAL y propone compra urgente de 578,100 pzas. Mi modelo clasifica LOW porque la cobertura total es 4.2 meses (0.73 stock + 3.5 en SC), superando el objetivo de 2 meses. Con YoY de -49%, nueva OC agravaria el sobreinventario. Accion propia: congelar OC y acelerar arribo del SC para cubrir el quiebre fisico de 22 dias.</w:t>
         <w:br/>
         <w:br/>
-        <w:t>- SUBSOL/60W (LOW propio / HIGH IA): Divergencia por horizonte de analisis. Mi modelo prioriza el YoY de -59% y el SC de 2.1 meses como senales de freno; la IA responde al stockout en 44 dias sin ponderar suficientemente la desaceleracion comercial sostenida. Un Director de Supply Chain priorizaria proteger el flujo.</w:t>
+        <w:t>- REFLED/300W (CRITICAL propio / HIGH IA): Acuerdo en urgencia, divergencia en volumen. Stockout en 6.6 dias vs lead time de 120 dias — brecha de -113 dias. Mi modelo sube a CRITICAL y recorta el volumen a 1 mes (vs 1.5 meses de la IA) dado el YoY de -64% y tendencia DECLINING. Comprar el volumen completo con demanda colapsada seria capital mal asignado.</w:t>
         <w:br/>
         <w:br/>
-        <w:t>- LED06/10W3 (HIGH propio / HIGH IA): Acuerdo en accion urgente. Mi modelo aplica compra escalonada (1 mes primero) por la tendencia STABLE y YoY negativo; la IA recomienda 26,160 pzas directas (2 meses) sin considerar la moderacion de demanda.</w:t>
+        <w:t>- SUBSOL/60W (LOW propio / HIGH IA): Divergencia por horizonte de analisis. La IA reacciona al stockout en 44 dias; mi modelo prioriza el YoY de -59% y la cobertura total de 3.6 meses. Clase A pero con caida sostenida — comprar 2,250 pzas adicionales incrementaria el sobreinventario. Postura conservadora justificada.</w:t>
         <w:br/>
         <w:br/>
-        <w:t>- ADAPTADOR/E40 (LOW propio / MEDIUM IA): Divergencia por saturacion de SC. Mi modelo frena la compra porque total cover de 3.5 meses supera el objetivo y el YoY es negativo pese a momentum positivo reciente. La IA recomienda compra normal de 500 pzas que mantiene el volumen objetivo. La postura conservadora es preferible ante senales mixtas.</w:t>
+        <w:t>- REFLED/200W (LOW propio / MEDIUM IA): Divergencia por saturacion de SC. La IA recomienda 1,960 pzas 'normales'. Mi modelo congela: SC de 4.76 meses con YoY -60% es excesivo. Primero consumir el transito antes de comprometer mas capital.</w:t>
         <w:br/>
         <w:br/>
-        <w:t>- LRD/9W (LOW propio / LOW IA): Acuerdo total. SC de 5.4 meses, tendencia DECLINING y YoY -57% justifican congelar compras y evaluar promocion para liberar capital. Unico SKU donde ambos modelos convergen en decision y racional.</w:t>
+        <w:t>- T-SUBFOT/100W-A (LOW propio / MEDIUM logístico IA): Convergencia en diagnostico, divergencia en accion. Ambos identifican SC saturado (7.1 meses). La IA acelera booking de 2,360 pzas; mi modelo frena porque 7.1 meses de cobertura es suficiente incluso con STRONG GROWTH. Prioridad: sincronizar arribos antes de emitir nueva OC.</w:t>
       </w:r>
     </w:p>
     <w:p>
@@ -1898,19 +1898,19 @@
         </w:rPr>
       </w:r>
       <w:r>
-        <w:t>La comparacion entre el modelo propio y la IA revela diferencias metodologicas relevantes. El modelo propio es mas conservador: clasifica como CRITICAL cualquier SKU donde el stockout ocurra antes de que el lead time de la SC permita reponer. La IA, en cambio, integra tres dimensiones adicionales que el analisis manual no captura facilmente:</w:t>
+        <w:t>La comparacion entre el modelo propio y la IA revela diferencias metodologicas relevantes en cinco dimensiones de planeacion: quiebre, forecast, compra excesiva, sobreinventario en SC y problema logistico.</w:t>
         <w:br/>
         <w:br/>
-        <w:t>1. Nivel real del forecast: un SKU con forecast cercano a cero (LED06/10W3) no merece la misma urgencia que uno con alta demanda, aunque ambos tengan stock minimo. La IA clasifica este caso como HIGH, no CRITICAL.</w:t>
+        <w:t>El modelo propio privilegia el flujo de caja: congela compras cuando la cobertura total supera 3 meses o el SC ya esta saturado, independientemente del urgency_score. La IA, en cambio, reacciona mas al stockout fisico inminente sin penalizar suficientemente el sobreinventario en transito ni el YoY negativo.</w:t>
         <w:br/>
         <w:br/>
-        <w:t>2. Timing de llegada del SC: la IA discrimina entre stock en transito vs en produccion. Si el inventario en SC puede llegar antes del stockout, la urgencia baja (SUBSOL/60W: HIGH en lugar de CRITICAL).</w:t>
+        <w:t>La divergencia mas relevante ocurre en LED06/10W.: la IA ordena compra urgente de 578,100 pzas ignorando que la cobertura total ya es de 4.2 meses. Mi modelo recomienda congelar la OC y acelerar el SC existente, lo cual protege el capital sin incrementar el riesgo de quiebre real.</w:t>
         <w:br/>
         <w:br/>
-        <w:t>3. Tendencia como ponderador: en SKUs con tendencia DECLINING y bajo forecast (LRD/9W), la IA recomienda compra minima aunque el stock sea limitado, priorizando otros articulos con mayor dinamismo comercial.</w:t>
+        <w:t>En REFLED/300W ambos modelos coinciden en urgencia alta, pero divergen en volumen: la IA propone 1.5 meses; mi modelo reduce a 1 mes dado el YoY de -64%.</w:t>
         <w:br/>
         <w:br/>
-        <w:t>El dashboard de Power BI permite visualizar estas dimensiones de forma integrada y tomar decisiones de planeacion con mayor contexto que un analisis tabular.</w:t>
+        <w:t>El dashboard integrado permite visualizar las cinco dimensiones simultaneamente y tomar decisiones de planeacion con mayor contexto que un analisis tabular.</w:t>
       </w:r>
     </w:p>
     <w:sectPr>

</xml_diff>